<commit_message>
docs: note OData v4 role requirement for probing tools
The DAC-based OData v4 interface returns HTTP 403 unless the grp-mcp user has
OData access (the OData v4 role). Without it, run_dac_odata, get_dac_metadata,
tree_triage, and DAC-metadata-backed screen probing all fail; contract REST is
unaffected. Added as a prerequisite step (Section 6) and a troubleshooting row.

Co-Authored-By: Claude Fable 5 <noreply@anthropic.com>
</commit_message>
<xml_diff>
--- a/grp-mcp-Installation-and-Setup-Guide.docx
+++ b/grp-mcp-Installation-and-Setup-Guide.docx
@@ -1475,6 +1475,137 @@
         </w:numPr>
       </w:pPr>
       <w:r>
+        <w:rPr>
+          <w:b/>
+        </w:rPr>
+        <w:t xml:space="preserve">Enable OData access for the account (required for probing).</w:t>
+      </w:r>
+      <w:r>
+        <w:t xml:space="preserve"> The grp-mcp user must have</w:t>
+      </w:r>
+      <w:r>
+        <w:t xml:space="preserve"> </w:t>
+      </w:r>
+      <w:r>
+        <w:t xml:space="preserve">the </w:t>
+      </w:r>
+      <w:r>
+        <w:rPr>
+          <w:b/>
+        </w:rPr>
+        <w:t xml:space="preserve">OData v4 role</w:t>
+      </w:r>
+      <w:r>
+        <w:t xml:space="preserve"> assigned (Acumatica screen </w:t>
+      </w:r>
+      <w:r>
+        <w:rPr>
+          <w:b/>
+        </w:rPr>
+        <w:t xml:space="preserve">Users</w:t>
+      </w:r>
+      <w:r>
+        <w:t xml:space="preserve">, </w:t>
+      </w:r>
+      <w:r>
+        <w:rPr>
+          <w:rFonts w:ascii="Courier New" w:hAnsi="Courier New"/>
+        </w:rPr>
+        <w:t xml:space="preserve">SM201010</w:t>
+      </w:r>
+      <w:r>
+        <w:t xml:space="preserve"> → </w:t>
+      </w:r>
+      <w:r>
+        <w:rPr>
+          <w:b/>
+        </w:rPr>
+        <w:t xml:space="preserve">User Roles</w:t>
+      </w:r>
+      <w:r>
+        <w:t xml:space="preserve">;</w:t>
+      </w:r>
+      <w:r>
+        <w:t xml:space="preserve"> </w:t>
+      </w:r>
+      <w:r>
+        <w:t xml:space="preserve">role management is </w:t>
+      </w:r>
+      <w:r>
+        <w:rPr>
+          <w:rFonts w:ascii="Courier New" w:hAnsi="Courier New"/>
+        </w:rPr>
+        <w:t xml:space="preserve">SM201005</w:t>
+      </w:r>
+      <w:r>
+        <w:t xml:space="preserve">). Without OData access, the DAC-based OData v4 interface returns</w:t>
+      </w:r>
+      <w:r>
+        <w:t xml:space="preserve"> </w:t>
+      </w:r>
+      <w:r>
+        <w:rPr>
+          <w:b/>
+        </w:rPr>
+        <w:t xml:space="preserve">HTTP 403</w:t>
+      </w:r>
+      <w:r>
+        <w:t xml:space="preserve"> and every </w:t>
+      </w:r>
+      <w:r>
+        <w:rPr>
+          <w:i/>
+        </w:rPr>
+        <w:t xml:space="preserve">probing</w:t>
+      </w:r>
+      <w:r>
+        <w:t xml:space="preserve"> tool fails — including </w:t>
+      </w:r>
+      <w:r>
+        <w:rPr>
+          <w:rFonts w:ascii="Courier New" w:hAnsi="Courier New"/>
+        </w:rPr>
+        <w:t xml:space="preserve">run_dac_odata</w:t>
+      </w:r>
+      <w:r>
+        <w:t xml:space="preserve">, </w:t>
+      </w:r>
+      <w:r>
+        <w:rPr>
+          <w:rFonts w:ascii="Courier New" w:hAnsi="Courier New"/>
+        </w:rPr>
+        <w:t xml:space="preserve">get_dac_metadata</w:t>
+      </w:r>
+      <w:r>
+        <w:t xml:space="preserve">,</w:t>
+      </w:r>
+      <w:r>
+        <w:t xml:space="preserve"> </w:t>
+      </w:r>
+      <w:r>
+        <w:rPr>
+          <w:rFonts w:ascii="Courier New" w:hAnsi="Courier New"/>
+        </w:rPr>
+        <w:t xml:space="preserve">tree_triage</w:t>
+      </w:r>
+      <w:r>
+        <w:t xml:space="preserve">, and any screen inspection that reads DAC metadata. Read/write over the contract</w:t>
+      </w:r>
+      <w:r>
+        <w:t xml:space="preserve"> </w:t>
+      </w:r>
+      <w:r>
+        <w:t xml:space="preserve">REST endpoint still works without it, but discovery/probing does not, so enable this.</w:t>
+      </w:r>
+    </w:p>
+    <w:p>
+      <w:pPr>
+        <w:numPr>
+          <w:ilvl w:val="0"/>
+          <w:numId w:val="2"/>
+        </w:numPr>
+      </w:pPr>
+      <w:r>
         <w:t xml:space="preserve">Record the instance </w:t>
       </w:r>
       <w:r>
@@ -3840,6 +3971,71 @@
           <w:p>
             <w:r>
               <w:t xml:space="preserve">Recheck the Connected Application values (Section 6)</w:t>
+            </w:r>
+          </w:p>
+        </w:tc>
+      </w:tr>
+      <w:tr>
+        <w:tc>
+          <w:p>
+            <w:r>
+              <w:rPr>
+                <w:rFonts w:ascii="Courier New" w:hAnsi="Courier New"/>
+              </w:rPr>
+              <w:t xml:space="preserve">HTTP 403</w:t>
+            </w:r>
+            <w:r>
+              <w:t xml:space="preserve"> on </w:t>
+            </w:r>
+            <w:r>
+              <w:rPr>
+                <w:rFonts w:ascii="Courier New" w:hAnsi="Courier New"/>
+              </w:rPr>
+              <w:t xml:space="preserve">run_dac_odata</w:t>
+            </w:r>
+            <w:r>
+              <w:t xml:space="preserve"> / </w:t>
+            </w:r>
+            <w:r>
+              <w:rPr>
+                <w:rFonts w:ascii="Courier New" w:hAnsi="Courier New"/>
+              </w:rPr>
+              <w:t xml:space="preserve">get_dac_metadata</w:t>
+            </w:r>
+            <w:r>
+              <w:t xml:space="preserve"> / </w:t>
+            </w:r>
+            <w:r>
+              <w:rPr>
+                <w:rFonts w:ascii="Courier New" w:hAnsi="Courier New"/>
+              </w:rPr>
+              <w:t xml:space="preserve">tree_triage</w:t>
+            </w:r>
+            <w:r>
+              <w:t xml:space="preserve"> / screen probes</w:t>
+            </w:r>
+          </w:p>
+        </w:tc>
+        <w:tc>
+          <w:p>
+            <w:r>
+              <w:t xml:space="preserve">Account lacks OData access</w:t>
+            </w:r>
+          </w:p>
+        </w:tc>
+        <w:tc>
+          <w:p>
+            <w:r>
+              <w:t xml:space="preserve">Assign the </w:t>
+            </w:r>
+            <w:r>
+              <w:rPr>
+                <w:b/>
+              </w:rPr>
+              <w:t xml:space="preserve">OData v4 role</w:t>
+            </w:r>
+            <w:r>
+              <w:t xml:space="preserve"> to the user (Section 6, step 6). Contract REST still works without it; probing does not</w:t>
             </w:r>
           </w:p>
         </w:tc>

</xml_diff>

<commit_message>
docs: setup guide docx to v0.51 (93 tools, discovery/execution/import suites, import-scenario troubleshooting rows)
Co-Authored-By: Claude Fable 5 <noreply@anthropic.com>
</commit_message>
<xml_diff>
--- a/grp-mcp-Installation-and-Setup-Guide.docx
+++ b/grp-mcp-Installation-and-Setup-Guide.docx
@@ -15,7 +15,7 @@
         <w:rPr>
           <w:b/>
         </w:rPr>
-        <w:t xml:space="preserve">Version 0.48 · Acumatica ERP MCP Server</w:t>
+        <w:t xml:space="preserve">Version 0.51 · Acumatica ERP MCP Server</w:t>
       </w:r>
     </w:p>
     <w:p>
@@ -222,6 +222,170 @@
       </w:r>
       <w:r>
         <w:t xml:space="preserve">classic plane can’t reach and full grid CRUD.</w:t>
+      </w:r>
+    </w:p>
+    <w:p>
+      <w:r>
+        <w:t xml:space="preserve">Across the four planes it exposes </w:t>
+      </w:r>
+      <w:r>
+        <w:rPr>
+          <w:b/>
+        </w:rPr>
+        <w:t xml:space="preserve">93 tools</w:t>
+      </w:r>
+      <w:r>
+        <w:t xml:space="preserve"> (v0.51). Beyond entity CRUD and screen</w:t>
+      </w:r>
+      <w:r>
+        <w:t xml:space="preserve"> </w:t>
+      </w:r>
+      <w:r>
+        <w:t xml:space="preserve">driving these include: </w:t>
+      </w:r>
+      <w:r>
+        <w:rPr>
+          <w:b/>
+        </w:rPr>
+        <w:t xml:space="preserve">setup discovery</w:t>
+      </w:r>
+      <w:r>
+        <w:t xml:space="preserve"> on a blind instance (</w:t>
+      </w:r>
+      <w:r>
+        <w:rPr>
+          <w:rFonts w:ascii="Courier New" w:hAnsi="Courier New"/>
+        </w:rPr>
+        <w:t xml:space="preserve">screen_prereqs</w:t>
+      </w:r>
+      <w:r>
+        <w:t xml:space="preserve">,</w:t>
+      </w:r>
+      <w:r>
+        <w:t xml:space="preserve"> </w:t>
+      </w:r>
+      <w:r>
+        <w:rPr>
+          <w:rFonts w:ascii="Courier New" w:hAnsi="Courier New"/>
+        </w:rPr>
+        <w:t xml:space="preserve">screen_discover_prereqs</w:t>
+      </w:r>
+      <w:r>
+        <w:t xml:space="preserve">, </w:t>
+      </w:r>
+      <w:r>
+        <w:rPr>
+          <w:rFonts w:ascii="Courier New" w:hAnsi="Courier New"/>
+        </w:rPr>
+        <w:t xml:space="preserve">module_setup_plan</w:t>
+      </w:r>
+      <w:r>
+        <w:t xml:space="preserve">, </w:t>
+      </w:r>
+      <w:r>
+        <w:rPr>
+          <w:rFonts w:ascii="Courier New" w:hAnsi="Courier New"/>
+        </w:rPr>
+        <w:t xml:space="preserve">screen_autofill</w:t>
+      </w:r>
+      <w:r>
+        <w:t xml:space="preserve"> — infer prerequisites and</w:t>
+      </w:r>
+      <w:r>
+        <w:t xml:space="preserve"> </w:t>
+      </w:r>
+      <w:r>
+        <w:t xml:space="preserve">build order with no source in hand), </w:t>
+      </w:r>
+      <w:r>
+        <w:rPr>
+          <w:b/>
+        </w:rPr>
+        <w:t xml:space="preserve">bulk execution</w:t>
+      </w:r>
+      <w:r>
+        <w:t xml:space="preserve"> (</w:t>
+      </w:r>
+      <w:r>
+        <w:rPr>
+          <w:rFonts w:ascii="Courier New" w:hAnsi="Courier New"/>
+        </w:rPr>
+        <w:t xml:space="preserve">screen_bulk_load</w:t>
+      </w:r>
+      <w:r>
+        <w:t xml:space="preserve"> — N master</w:t>
+      </w:r>
+      <w:r>
+        <w:t xml:space="preserve"> </w:t>
+      </w:r>
+      <w:r>
+        <w:t xml:space="preserve">records to any classic screen with no endpoint entity; </w:t>
+      </w:r>
+      <w:r>
+        <w:rPr>
+          <w:rFonts w:ascii="Courier New" w:hAnsi="Courier New"/>
+        </w:rPr>
+        <w:t xml:space="preserve">ensure_entity_on_endpoint</w:t>
+      </w:r>
+      <w:r>
+        <w:t xml:space="preserve"> — make a</w:t>
+      </w:r>
+      <w:r>
+        <w:t xml:space="preserve"> </w:t>
+      </w:r>
+      <w:r>
+        <w:t xml:space="preserve">screen REST-drivable in one call), and a </w:t>
+      </w:r>
+      <w:r>
+        <w:rPr>
+          <w:b/>
+        </w:rPr>
+        <w:t xml:space="preserve">guarded Excel import-scenario suite</w:t>
+      </w:r>
+      <w:r>
+        <w:t xml:space="preserve"> </w:t>
+      </w:r>
+      <w:r>
+        <w:t xml:space="preserve">(</w:t>
+      </w:r>
+      <w:r>
+        <w:rPr>
+          <w:rFonts w:ascii="Courier New" w:hAnsi="Courier New"/>
+        </w:rPr>
+        <w:t xml:space="preserve">build_import_scenario</w:t>
+      </w:r>
+      <w:r>
+        <w:t xml:space="preserve"> + </w:t>
+      </w:r>
+      <w:r>
+        <w:rPr>
+          <w:rFonts w:ascii="Courier New" w:hAnsi="Courier New"/>
+        </w:rPr>
+        <w:t xml:space="preserve">import_excel</w:t>
+      </w:r>
+      <w:r>
+        <w:t xml:space="preserve"> — create and run SM206025/SM206036 scenarios with</w:t>
+      </w:r>
+      <w:r>
+        <w:t xml:space="preserve"> </w:t>
+      </w:r>
+      <w:r>
+        <w:t xml:space="preserve">the known silent-failure traps caught up front). When unsure which tool fits, ask Claude to</w:t>
+      </w:r>
+      <w:r>
+        <w:t xml:space="preserve"> </w:t>
+      </w:r>
+      <w:r>
+        <w:t xml:space="preserve">call </w:t>
+      </w:r>
+      <w:r>
+        <w:rPr>
+          <w:rFonts w:ascii="Courier New" w:hAnsi="Courier New"/>
+        </w:rPr>
+        <w:t xml:space="preserve">guide</w:t>
+      </w:r>
+      <w:r>
+        <w:t xml:space="preserve"> first — it routes by task.</w:t>
       </w:r>
     </w:p>
     <w:p>
@@ -4195,6 +4359,183 @@
           </w:p>
         </w:tc>
       </w:tr>
+      <w:tr>
+        <w:tc>
+          <w:p>
+            <w:r>
+              <w:t xml:space="preserve">Import scenario </w:t>
+            </w:r>
+            <w:r>
+              <w:rPr>
+                <w:b/>
+              </w:rPr>
+              <w:t xml:space="preserve">Prepare stages 0 rows</w:t>
+            </w:r>
+            <w:r>
+              <w:t xml:space="preserve"> (no error)</w:t>
+            </w:r>
+          </w:p>
+        </w:tc>
+        <w:tc>
+          <w:p>
+            <w:r>
+              <w:t xml:space="preserve">One of three silent causes: the .xlsx was authored by </w:t>
+            </w:r>
+            <w:r>
+              <w:rPr>
+                <w:b/>
+              </w:rPr>
+              <w:t xml:space="preserve">openpyxl</w:t>
+            </w:r>
+            <w:r>
+              <w:t xml:space="preserve"> (Acumatica’s Excel provider can’t read it — author with real Excel); the provider’s </w:t>
+            </w:r>
+            <w:r>
+              <w:rPr>
+                <w:b/>
+              </w:rPr>
+              <w:t xml:space="preserve">FileName parameter</w:t>
+            </w:r>
+            <w:r>
+              <w:t xml:space="preserve"> still says </w:t>
+            </w:r>
+            <w:r>
+              <w:rPr>
+                <w:rFonts w:ascii="Courier New" w:hAnsi="Courier New"/>
+              </w:rPr>
+              <w:t xml:space="preserve">&lt;EmptyFileName&gt;</w:t>
+            </w:r>
+            <w:r>
+              <w:t xml:space="preserve"> / an old file; the provider </w:t>
+            </w:r>
+            <w:r>
+              <w:rPr>
+                <w:b/>
+              </w:rPr>
+              <w:t xml:space="preserve">object name doesn’t match the worksheet name</w:t>
+            </w:r>
+          </w:p>
+        </w:tc>
+        <w:tc>
+          <w:p>
+            <w:r>
+              <w:t xml:space="preserve">Use </w:t>
+            </w:r>
+            <w:r>
+              <w:rPr>
+                <w:rFonts w:ascii="Courier New" w:hAnsi="Courier New"/>
+              </w:rPr>
+              <w:t xml:space="preserve">import_excel</w:t>
+            </w:r>
+            <w:r>
+              <w:t xml:space="preserve"> — it guards all three up front and fails loud with a checklist. Providers built by </w:t>
+            </w:r>
+            <w:r>
+              <w:rPr>
+                <w:rFonts w:ascii="Courier New" w:hAnsi="Courier New"/>
+              </w:rPr>
+              <w:t xml:space="preserve">setup_data_provider</w:t>
+            </w:r>
+            <w:r>
+              <w:t xml:space="preserve"> v0.51+ are pointed automatically</w:t>
+            </w:r>
+          </w:p>
+        </w:tc>
+      </w:tr>
+      <w:tr>
+        <w:tc>
+          <w:p>
+            <w:r>
+              <w:rPr>
+                <w:rFonts w:ascii="Courier New" w:hAnsi="Courier New"/>
+              </w:rPr>
+              <w:t xml:space="preserve">run_import_scenario</w:t>
+            </w:r>
+            <w:r>
+              <w:t xml:space="preserve"> crashes </w:t>
+            </w:r>
+            <w:r>
+              <w:rPr>
+                <w:rFonts w:ascii="Courier New" w:hAnsi="Courier New"/>
+              </w:rPr>
+              <w:t xml:space="preserve">Sequence contains no matching element</w:t>
+            </w:r>
+          </w:p>
+        </w:tc>
+        <w:tc>
+          <w:p>
+            <w:r>
+              <w:t xml:space="preserve">The contract-REST import path (SYImportSimple) breaks on many target screens — even trivial mappings</w:t>
+            </w:r>
+          </w:p>
+        </w:tc>
+        <w:tc>
+          <w:p>
+            <w:r>
+              <w:t xml:space="preserve">Use </w:t>
+            </w:r>
+            <w:r>
+              <w:rPr>
+                <w:rFonts w:ascii="Courier New" w:hAnsi="Courier New"/>
+              </w:rPr>
+              <w:t xml:space="preserve">import_excel</w:t>
+            </w:r>
+            <w:r>
+              <w:t xml:space="preserve"> (classic-plane runner) instead</w:t>
+            </w:r>
+          </w:p>
+        </w:tc>
+      </w:tr>
+      <w:tr>
+        <w:tc>
+          <w:p>
+            <w:r>
+              <w:t xml:space="preserve">Mapping/detail rows saved “ok” but read back wrong</w:t>
+            </w:r>
+          </w:p>
+        </w:tc>
+        <w:tc>
+          <w:p>
+            <w:r>
+              <w:t xml:space="preserve">Batching many </w:t>
+            </w:r>
+            <w:r>
+              <w:rPr>
+                <w:rFonts w:ascii="Courier New" w:hAnsi="Courier New"/>
+              </w:rPr>
+              <w:t xml:space="preserve">new_row</w:t>
+            </w:r>
+            <w:r>
+              <w:t xml:space="preserve"> in one submit corrupts silently on state-dependent grids</w:t>
+            </w:r>
+          </w:p>
+        </w:tc>
+        <w:tc>
+          <w:p>
+            <w:r>
+              <w:t xml:space="preserve">Write one row per call (</w:t>
+            </w:r>
+            <w:r>
+              <w:rPr>
+                <w:rFonts w:ascii="Courier New" w:hAnsi="Courier New"/>
+              </w:rPr>
+              <w:t xml:space="preserve">build_import_scenario</w:t>
+            </w:r>
+            <w:r>
+              <w:t xml:space="preserve"> / </w:t>
+            </w:r>
+            <w:r>
+              <w:rPr>
+                <w:rFonts w:ascii="Courier New" w:hAnsi="Courier New"/>
+              </w:rPr>
+              <w:t xml:space="preserve">screen_bulk_load</w:t>
+            </w:r>
+            <w:r>
+              <w:t xml:space="preserve"> do this); always read back</w:t>
+            </w:r>
+          </w:p>
+        </w:tc>
+      </w:tr>
     </w:tbl>
     <w:p>
       <w:pPr>
@@ -4267,7 +4608,7 @@
         <w:rPr>
           <w:rFonts w:ascii="Courier New" w:hAnsi="Courier New"/>
         </w:rPr>
-        <w:t xml:space="preserve">uvx grp-mcp==0.48.0</w:t>
+        <w:t xml:space="preserve">uvx grp-mcp==0.51.0</w:t>
       </w:r>
       <w:r>
         <w:t xml:space="preserve">). After any upgrade, </w:t>
@@ -4656,7 +4997,7 @@
         <w:rPr>
           <w:i/>
         </w:rPr>
-        <w:t xml:space="preserve">grp-mcp v0.48 · Published on PyPI as </w:t>
+        <w:t xml:space="preserve">grp-mcp v0.51 · Published on PyPI as </w:t>
       </w:r>
       <w:r>
         <w:rPr>

</xml_diff>

<commit_message>
docs: update setup guide to v0.52.1 + add KNOWLEDGE.md
Guide (docx + new markdown source):
- Sharper prerequisites: Python is NOT installed by hand for the normal
  uvx path (uv provisions it); only needed for the from-source dev path.
- New "Data migration" section: the SM206015->SM206025->SM206036 pipeline,
  clone-the-vendor-recipe via stock_scenario_info, and the reliability
  rules (real Excel, fresh file, plain columns, priming field, 0-fill,
  <Save>, trust IsProcessed).
- Troubleshooting rows for the new import findings; ~95 tools.
- Keep the markdown source in-repo so future updates edit md -> regenerate.

KNOWLEDGE.md: distilled, SANITIZED operational reference (four planes,
KB-first policy, screen-SOAP command mechanics + no-bind signal, modern
UI-screen protocol, data-migration recipe/traps, GL setup order,
segment values, company tree, connection/seat gotchas, publishing).
No instance/tenant/client specifics.

Co-Authored-By: Claude Opus 4.8 <noreply@anthropic.com>
</commit_message>
<xml_diff>
--- a/grp-mcp-Installation-and-Setup-Guide.docx
+++ b/grp-mcp-Installation-and-Setup-Guide.docx
@@ -15,7 +15,7 @@
         <w:rPr>
           <w:b/>
         </w:rPr>
-        <w:t xml:space="preserve">Version 0.51 · Acumatica ERP MCP Server</w:t>
+        <w:t xml:space="preserve">Version 0.52.1 · Acumatica ERP MCP Server</w:t>
       </w:r>
     </w:p>
     <w:p>
@@ -232,10 +232,10 @@
         <w:rPr>
           <w:b/>
         </w:rPr>
-        <w:t xml:space="preserve">93 tools</w:t>
-      </w:r>
-      <w:r>
-        <w:t xml:space="preserve"> (v0.51). Beyond entity CRUD and screen</w:t>
+        <w:t xml:space="preserve">~95 tools</w:t>
+      </w:r>
+      <w:r>
+        <w:t xml:space="preserve"> (v0.52.1). Beyond entity CRUD and screen</w:t>
       </w:r>
       <w:r>
         <w:t xml:space="preserve"> </w:t>
@@ -340,7 +340,7 @@
         <w:rPr>
           <w:b/>
         </w:rPr>
-        <w:t xml:space="preserve">guarded Excel import-scenario suite</w:t>
+        <w:t xml:space="preserve">guarded data-migration suite</w:t>
       </w:r>
       <w:r>
         <w:t xml:space="preserve"> </w:t>
@@ -352,6 +352,15 @@
         <w:rPr>
           <w:rFonts w:ascii="Courier New" w:hAnsi="Courier New"/>
         </w:rPr>
+        <w:t xml:space="preserve">setup_data_provider</w:t>
+      </w:r>
+      <w:r>
+        <w:t xml:space="preserve"> + </w:t>
+      </w:r>
+      <w:r>
+        <w:rPr>
+          <w:rFonts w:ascii="Courier New" w:hAnsi="Courier New"/>
+        </w:rPr>
         <w:t xml:space="preserve">build_import_scenario</w:t>
       </w:r>
       <w:r>
@@ -364,19 +373,31 @@
         <w:t xml:space="preserve">import_excel</w:t>
       </w:r>
       <w:r>
-        <w:t xml:space="preserve"> — create and run SM206025/SM206036 scenarios with</w:t>
-      </w:r>
-      <w:r>
-        <w:t xml:space="preserve"> </w:t>
-      </w:r>
-      <w:r>
-        <w:t xml:space="preserve">the known silent-failure traps caught up front). When unsure which tool fits, ask Claude to</w:t>
-      </w:r>
-      <w:r>
-        <w:t xml:space="preserve"> </w:t>
-      </w:r>
-      <w:r>
-        <w:t xml:space="preserve">call </w:t>
+        <w:t xml:space="preserve"> + </w:t>
+      </w:r>
+      <w:r>
+        <w:rPr>
+          <w:rFonts w:ascii="Courier New" w:hAnsi="Courier New"/>
+        </w:rPr>
+        <w:t xml:space="preserve">stock_scenario_info</w:t>
+      </w:r>
+      <w:r>
+        <w:t xml:space="preserve"> —</w:t>
+      </w:r>
+      <w:r>
+        <w:t xml:space="preserve"> </w:t>
+      </w:r>
+      <w:r>
+        <w:t xml:space="preserve">create and run SM206015/SM206025/SM206036 import scenarios with the known silent-failure</w:t>
+      </w:r>
+      <w:r>
+        <w:t xml:space="preserve"> </w:t>
+      </w:r>
+      <w:r>
+        <w:t xml:space="preserve">traps caught up front; see Section 13.4). When unsure which tool fits, ask Claude to call</w:t>
+      </w:r>
+      <w:r>
+        <w:t xml:space="preserve"> </w:t>
       </w:r>
       <w:r>
         <w:rPr>
@@ -725,7 +746,7 @@
         <w:pStyle w:val="Heading3"/>
       </w:pPr>
       <w:r>
-        <w:t xml:space="preserve">3.1 Runtime</w:t>
+        <w:t xml:space="preserve">3.1 Prerequisites at a glance</w:t>
       </w:r>
     </w:p>
     <w:tbl>
@@ -748,7 +769,7 @@
               <w:rPr>
                 <w:b/>
               </w:rPr>
-              <w:t xml:space="preserve">Dependency</w:t>
+              <w:t xml:space="preserve">Prerequisite</w:t>
             </w:r>
           </w:p>
         </w:tc>
@@ -758,7 +779,7 @@
               <w:rPr>
                 <w:b/>
               </w:rPr>
-              <w:t xml:space="preserve">Version</w:t>
+              <w:t xml:space="preserve">Requirement</w:t>
             </w:r>
           </w:p>
         </w:tc>
@@ -768,7 +789,7 @@
               <w:rPr>
                 <w:b/>
               </w:rPr>
-              <w:t xml:space="preserve">Notes</w:t>
+              <w:t xml:space="preserve">How to get it</w:t>
             </w:r>
           </w:p>
         </w:tc>
@@ -800,6 +821,9 @@
         <w:tc>
           <w:p>
             <w:r>
+              <w:rPr>
+                <w:b/>
+              </w:rPr>
               <w:t xml:space="preserve">Python</w:t>
             </w:r>
           </w:p>
@@ -810,7 +834,7 @@
               <w:rPr>
                 <w:b/>
               </w:rPr>
-              <w:t xml:space="preserve">3.10 or newer</w:t>
+              <w:t xml:space="preserve">3.10 or newer — but you usually do NOT install it yourself</w:t>
             </w:r>
           </w:p>
         </w:tc>
@@ -823,7 +847,7 @@
               <w:t xml:space="preserve">uv</w:t>
             </w:r>
             <w:r>
-              <w:t xml:space="preserve"> can provision this for you — no separate Python install strictly required</w:t>
+              <w:t xml:space="preserve"> provisions a suitable Python automatically. Only install Python manually if you plan to develop grp-mcp from source (Section 13.2)</w:t>
             </w:r>
           </w:p>
         </w:tc>
@@ -838,6 +862,9 @@
               <w:t xml:space="preserve">uv</w:t>
             </w:r>
             <w:r>
+              <w:rPr>
+                <w:b/>
+              </w:rPr>
               <w:t xml:space="preserve"> / </w:t>
             </w:r>
             <w:r>
@@ -858,7 +885,7 @@
         <w:tc>
           <w:p>
             <w:r>
-              <w:t xml:space="preserve">The package runner used to fetch and launch grp-mcp</w:t>
+              <w:t xml:space="preserve">Section 4 — one-time install; this is the only mandatory manual prerequisite besides the Claude host</w:t>
             </w:r>
           </w:p>
         </w:tc>
@@ -881,12 +908,94 @@
         <w:tc>
           <w:p>
             <w:r>
-              <w:t xml:space="preserve">The MCP host that loads the server</w:t>
+              <w:t xml:space="preserve">Section 5 — the MCP host that loads the server</w:t>
+            </w:r>
+          </w:p>
+        </w:tc>
+      </w:tr>
+      <w:tr>
+        <w:tc>
+          <w:p>
+            <w:r>
+              <w:t xml:space="preserve">Internet access</w:t>
+            </w:r>
+          </w:p>
+        </w:tc>
+        <w:tc>
+          <w:p>
+            <w:r>
+              <w:t xml:space="preserve">—</w:t>
+            </w:r>
+          </w:p>
+        </w:tc>
+        <w:tc>
+          <w:p>
+            <w:r>
+              <w:t xml:space="preserve">Needed once to download the package + dependencies (then cached)</w:t>
             </w:r>
           </w:p>
         </w:tc>
       </w:tr>
     </w:tbl>
+    <w:p>
+      <w:pPr>
+        <w:pStyle w:val="BlockQuote"/>
+      </w:pPr>
+      <w:r>
+        <w:rPr>
+          <w:b/>
+        </w:rPr>
+        <w:t xml:space="preserve">Do I need Python?</w:t>
+      </w:r>
+      <w:r>
+        <w:t xml:space="preserve"> No, not by hand for the normal install. </w:t>
+      </w:r>
+      <w:r>
+        <w:rPr>
+          <w:rFonts w:ascii="Courier New" w:hAnsi="Courier New"/>
+        </w:rPr>
+        <w:t xml:space="preserve">uvx</w:t>
+      </w:r>
+      <w:r>
+        <w:t xml:space="preserve"> downloads the package</w:t>
+      </w:r>
+      <w:r>
+        <w:t xml:space="preserve"> </w:t>
+      </w:r>
+      <w:r>
+        <w:rPr>
+          <w:i/>
+        </w:rPr>
+        <w:t xml:space="preserve">and</w:t>
+      </w:r>
+      <w:r>
+        <w:t xml:space="preserve"> a matching Python runtime if none is found. A manual Python 3.10+ install is only</w:t>
+      </w:r>
+      <w:r>
+        <w:t xml:space="preserve"> </w:t>
+      </w:r>
+      <w:r>
+        <w:t xml:space="preserve">required for the </w:t>
+      </w:r>
+      <w:r>
+        <w:rPr>
+          <w:b/>
+        </w:rPr>
+        <w:t xml:space="preserve">from-source developer path</w:t>
+      </w:r>
+      <w:r>
+        <w:t xml:space="preserve"> (Section 13.2), where </w:t>
+      </w:r>
+      <w:r>
+        <w:rPr>
+          <w:rFonts w:ascii="Courier New" w:hAnsi="Courier New"/>
+        </w:rPr>
+        <w:t xml:space="preserve">pip install -e</w:t>
+      </w:r>
+      <w:r>
+        <w:t xml:space="preserve"> is used.</w:t>
+      </w:r>
+    </w:p>
     <w:p>
       <w:pPr>
         <w:pStyle w:val="Heading3"/>
@@ -1400,7 +1509,7 @@
         <w:t xml:space="preserve"> </w:t>
       </w:r>
       <w:r>
-        <w:t xml:space="preserve">server (Section 8) — everything else is identical.</w:t>
+        <w:t xml:space="preserve">server (Section 9) — everything else is identical.</w:t>
       </w:r>
     </w:p>
     <w:p>
@@ -1753,13 +1862,28 @@
         <w:t xml:space="preserve">tree_triage</w:t>
       </w:r>
       <w:r>
-        <w:t xml:space="preserve">, and any screen inspection that reads DAC metadata. Read/write over the contract</w:t>
-      </w:r>
-      <w:r>
-        <w:t xml:space="preserve"> </w:t>
-      </w:r>
-      <w:r>
-        <w:t xml:space="preserve">REST endpoint still works without it, but discovery/probing does not, so enable this.</w:t>
+        <w:t xml:space="preserve">, </w:t>
+      </w:r>
+      <w:r>
+        <w:rPr>
+          <w:rFonts w:ascii="Courier New" w:hAnsi="Courier New"/>
+        </w:rPr>
+        <w:t xml:space="preserve">stock_scenario_info</w:t>
+      </w:r>
+      <w:r>
+        <w:t xml:space="preserve">, and any screen inspection that reads DAC metadata.</w:t>
+      </w:r>
+      <w:r>
+        <w:t xml:space="preserve"> </w:t>
+      </w:r>
+      <w:r>
+        <w:t xml:space="preserve">Read/write over the contract REST endpoint still works without it, but discovery/probing does</w:t>
+      </w:r>
+      <w:r>
+        <w:t xml:space="preserve"> </w:t>
+      </w:r>
+      <w:r>
+        <w:t xml:space="preserve">not, so enable this.</w:t>
       </w:r>
     </w:p>
     <w:p>
@@ -2227,7 +2351,7 @@
         <w:t xml:space="preserve"> </w:t>
       </w:r>
       <w:r>
-        <w:t xml:space="preserve">Section 8. The page never returns your secret/password to the browser once saved (only whether</w:t>
+        <w:t xml:space="preserve">Section 9. The page never returns your secret/password to the browser once saved (only whether</w:t>
       </w:r>
       <w:r>
         <w:t xml:space="preserve"> </w:t>
@@ -4176,6 +4300,15 @@
               <w:t xml:space="preserve">tree_triage</w:t>
             </w:r>
             <w:r>
+              <w:t xml:space="preserve"> / </w:t>
+            </w:r>
+            <w:r>
+              <w:rPr>
+                <w:rFonts w:ascii="Courier New" w:hAnsi="Courier New"/>
+              </w:rPr>
+              <w:t xml:space="preserve">stock_scenario_info</w:t>
+            </w:r>
+            <w:r>
               <w:t xml:space="preserve"> / screen probes</w:t>
             </w:r>
           </w:p>
@@ -4437,7 +4570,7 @@
               <w:t xml:space="preserve">setup_data_provider</w:t>
             </w:r>
             <w:r>
-              <w:t xml:space="preserve"> v0.51+ are pointed automatically</w:t>
+              <w:t xml:space="preserve"> are pointed automatically</w:t>
             </w:r>
           </w:p>
         </w:tc>
@@ -4446,6 +4579,213 @@
         <w:tc>
           <w:p>
             <w:r>
+              <w:t xml:space="preserve">Import finishes but </w:t>
+            </w:r>
+            <w:r>
+              <w:rPr>
+                <w:b/>
+              </w:rPr>
+              <w:t xml:space="preserve">0 rows Processed</w:t>
+            </w:r>
+            <w:r>
+              <w:t xml:space="preserve"> and no error</w:t>
+            </w:r>
+          </w:p>
+        </w:tc>
+        <w:tc>
+          <w:p>
+            <w:r>
+              <w:t xml:space="preserve">The mapping stages fields but never commits — missing the trailing </w:t>
+            </w:r>
+            <w:r>
+              <w:rPr>
+                <w:rFonts w:ascii="Courier New" w:hAnsi="Courier New"/>
+              </w:rPr>
+              <w:t xml:space="preserve">&lt;Save&gt;</w:t>
+            </w:r>
+            <w:r>
+              <w:t xml:space="preserve"> action row</w:t>
+            </w:r>
+          </w:p>
+        </w:tc>
+        <w:tc>
+          <w:p>
+            <w:r>
+              <w:rPr>
+                <w:rFonts w:ascii="Courier New" w:hAnsi="Courier New"/>
+              </w:rPr>
+              <w:t xml:space="preserve">build_import_scenario</w:t>
+            </w:r>
+            <w:r>
+              <w:t xml:space="preserve"> appends </w:t>
+            </w:r>
+            <w:r>
+              <w:rPr>
+                <w:rFonts w:ascii="Courier New" w:hAnsi="Courier New"/>
+              </w:rPr>
+              <w:t xml:space="preserve">&lt;Save&gt;</w:t>
+            </w:r>
+            <w:r>
+              <w:t xml:space="preserve"> automatically; the honest signal is </w:t>
+            </w:r>
+            <w:r>
+              <w:rPr>
+                <w:rFonts w:ascii="Courier New" w:hAnsi="Courier New"/>
+              </w:rPr>
+              <w:t xml:space="preserve">IsProcessed</w:t>
+            </w:r>
+            <w:r>
+              <w:t xml:space="preserve">, not the “finished” status</w:t>
+            </w:r>
+          </w:p>
+        </w:tc>
+      </w:tr>
+      <w:tr>
+        <w:tc>
+          <w:p>
+            <w:r>
+              <w:t xml:space="preserve">Import fails </w:t>
+            </w:r>
+            <w:r>
+              <w:rPr>
+                <w:rFonts w:ascii="Courier New" w:hAnsi="Courier New"/>
+              </w:rPr>
+              <w:t xml:space="preserve">'BaseQty' cannot be empty</w:t>
+            </w:r>
+            <w:r>
+              <w:t xml:space="preserve"> (or similar computed field)</w:t>
+            </w:r>
+          </w:p>
+        </w:tc>
+        <w:tc>
+          <w:p>
+            <w:r>
+              <w:t xml:space="preserve">A numeric field (Qty/Amount) was mapped to a </w:t>
+            </w:r>
+            <w:r>
+              <w:rPr>
+                <w:b/>
+              </w:rPr>
+              <w:t xml:space="preserve">bare literal</w:t>
+            </w:r>
+            <w:r>
+              <w:t xml:space="preserve"> (read as a phantom source column → empty), or a </w:t>
+            </w:r>
+            <w:r>
+              <w:rPr>
+                <w:b/>
+              </w:rPr>
+              <w:t xml:space="preserve">priming field was omitted</w:t>
+            </w:r>
+            <w:r>
+              <w:t xml:space="preserve"> (e.g. AR line needs </w:t>
+            </w:r>
+            <w:r>
+              <w:rPr>
+                <w:rFonts w:ascii="Courier New" w:hAnsi="Courier New"/>
+              </w:rPr>
+              <w:t xml:space="preserve">InventoryID</w:t>
+            </w:r>
+            <w:r>
+              <w:t xml:space="preserve"> mapped before </w:t>
+            </w:r>
+            <w:r>
+              <w:rPr>
+                <w:rFonts w:ascii="Courier New" w:hAnsi="Courier New"/>
+              </w:rPr>
+              <w:t xml:space="preserve">Qty</w:t>
+            </w:r>
+            <w:r>
+              <w:t xml:space="preserve">)</w:t>
+            </w:r>
+          </w:p>
+        </w:tc>
+        <w:tc>
+          <w:p>
+            <w:r>
+              <w:t xml:space="preserve">Map numeric fields to a </w:t>
+            </w:r>
+            <w:r>
+              <w:rPr>
+                <w:b/>
+              </w:rPr>
+              <w:t xml:space="preserve">real column</w:t>
+            </w:r>
+            <w:r>
+              <w:t xml:space="preserve">, and mirror the vendor recipe’s field order — call </w:t>
+            </w:r>
+            <w:r>
+              <w:rPr>
+                <w:rFonts w:ascii="Courier New" w:hAnsi="Courier New"/>
+              </w:rPr>
+              <w:t xml:space="preserve">stock_scenario_info(screen_id)</w:t>
+            </w:r>
+            <w:r>
+              <w:t xml:space="preserve">; </w:t>
+            </w:r>
+            <w:r>
+              <w:rPr>
+                <w:rFonts w:ascii="Courier New" w:hAnsi="Courier New"/>
+              </w:rPr>
+              <w:t xml:space="preserve">build_import_scenario</w:t>
+            </w:r>
+            <w:r>
+              <w:t xml:space="preserve">‘s preflight warns on both</w:t>
+            </w:r>
+          </w:p>
+        </w:tc>
+      </w:tr>
+      <w:tr>
+        <w:tc>
+          <w:p>
+            <w:r>
+              <w:t xml:space="preserve">GL import fails </w:t>
+            </w:r>
+            <w:r>
+              <w:rPr>
+                <w:rFonts w:ascii="Courier New" w:hAnsi="Courier New"/>
+              </w:rPr>
+              <w:t xml:space="preserve">'CreditAmt' cannot be empty</w:t>
+            </w:r>
+          </w:p>
+        </w:tc>
+        <w:tc>
+          <w:p>
+            <w:r>
+              <w:t xml:space="preserve">Debit/credit columns alternate blanks; a blank cell imports as EMPTY</w:t>
+            </w:r>
+          </w:p>
+        </w:tc>
+        <w:tc>
+          <w:p>
+            <w:r>
+              <w:t xml:space="preserve">Put an explicit </w:t>
+            </w:r>
+            <w:r>
+              <w:rPr>
+                <w:rFonts w:ascii="Courier New" w:hAnsi="Courier New"/>
+              </w:rPr>
+              <w:t xml:space="preserve">0</w:t>
+            </w:r>
+            <w:r>
+              <w:t xml:space="preserve"> in the empty side, and re-import with a </w:t>
+            </w:r>
+            <w:r>
+              <w:rPr>
+                <w:b/>
+              </w:rPr>
+              <w:t xml:space="preserve">fresh file</w:t>
+            </w:r>
+            <w:r>
+              <w:t xml:space="preserve"> (a same-name re-upload can read a stale cached copy)</w:t>
+            </w:r>
+          </w:p>
+        </w:tc>
+      </w:tr>
+      <w:tr>
+        <w:tc>
+          <w:p>
+            <w:r>
               <w:rPr>
                 <w:rFonts w:ascii="Courier New" w:hAnsi="Courier New"/>
               </w:rPr>
@@ -4465,7 +4805,7 @@
         <w:tc>
           <w:p>
             <w:r>
-              <w:t xml:space="preserve">The contract-REST import path (SYImportSimple) breaks on many target screens — even trivial mappings</w:t>
+              <w:t xml:space="preserve">The contract-REST import path breaks on many target screens</w:t>
             </w:r>
           </w:p>
         </w:tc>
@@ -4608,7 +4948,7 @@
         <w:rPr>
           <w:rFonts w:ascii="Courier New" w:hAnsi="Courier New"/>
         </w:rPr>
-        <w:t xml:space="preserve">uvx grp-mcp==0.51.0</w:t>
+        <w:t xml:space="preserve">uvx grp-mcp==0.52.1</w:t>
       </w:r>
       <w:r>
         <w:t xml:space="preserve">). After any upgrade, </w:t>
@@ -4727,7 +5067,28 @@
     </w:p>
     <w:p>
       <w:r>
-        <w:t xml:space="preserve">If you’re modifying grp-mcp rather than just running it:</w:t>
+        <w:t xml:space="preserve">If you’re modifying grp-mcp rather than just running it, a </w:t>
+      </w:r>
+      <w:r>
+        <w:rPr>
+          <w:b/>
+        </w:rPr>
+        <w:t xml:space="preserve">manual Python 3.10+ install is</w:t>
+      </w:r>
+      <w:r>
+        <w:rPr>
+          <w:b/>
+        </w:rPr>
+        <w:t xml:space="preserve"> </w:t>
+      </w:r>
+      <w:r>
+        <w:rPr>
+          <w:b/>
+        </w:rPr>
+        <w:t xml:space="preserve">required</w:t>
+      </w:r>
+      <w:r>
+        <w:t xml:space="preserve"> for this path:</w:t>
       </w:r>
     </w:p>
     <w:p>
@@ -4847,6 +5208,526 @@
       </w:r>
       <w:r>
         <w:t xml:space="preserve">setup screens. It is configured and installed separately.</w:t>
+      </w:r>
+    </w:p>
+    <w:p>
+      <w:pPr>
+        <w:pStyle w:val="Heading3"/>
+      </w:pPr>
+      <w:r>
+        <w:t xml:space="preserve">13.4 Data migration (Data Provider → Import Scenario → Import by Scenario)</w:t>
+      </w:r>
+    </w:p>
+    <w:p>
+      <w:r>
+        <w:t xml:space="preserve">Bulk data migration in Acumatica runs through a </w:t>
+      </w:r>
+      <w:r>
+        <w:rPr>
+          <w:b/>
+        </w:rPr>
+        <w:t xml:space="preserve">three-screen pipeline</w:t>
+      </w:r>
+      <w:r>
+        <w:t xml:space="preserve">, and grp-mcp drives all</w:t>
+      </w:r>
+      <w:r>
+        <w:t xml:space="preserve"> </w:t>
+      </w:r>
+      <w:r>
+        <w:t xml:space="preserve">three end-to-end (proven committing on AR301000 invoices, GL301000 journal batches, and AR303000</w:t>
+      </w:r>
+      <w:r>
+        <w:t xml:space="preserve"> </w:t>
+      </w:r>
+      <w:r>
+        <w:t xml:space="preserve">customers):</w:t>
+      </w:r>
+    </w:p>
+    <w:p>
+      <w:pPr>
+        <w:numPr>
+          <w:ilvl w:val="0"/>
+          <w:numId w:val="2"/>
+        </w:numPr>
+      </w:pPr>
+      <w:r>
+        <w:rPr>
+          <w:b/>
+        </w:rPr>
+        <w:t xml:space="preserve">Data Provider</w:t>
+      </w:r>
+      <w:r>
+        <w:t xml:space="preserve"> (</w:t>
+      </w:r>
+      <w:r>
+        <w:rPr>
+          <w:rFonts w:ascii="Courier New" w:hAnsi="Courier New"/>
+        </w:rPr>
+        <w:t xml:space="preserve">SM206015</w:t>
+      </w:r>
+      <w:r>
+        <w:t xml:space="preserve">) — points at the source file and defines its columns.</w:t>
+      </w:r>
+      <w:r>
+        <w:t xml:space="preserve"> </w:t>
+      </w:r>
+      <w:r>
+        <w:t xml:space="preserve">→ </w:t>
+      </w:r>
+      <w:r>
+        <w:rPr>
+          <w:rFonts w:ascii="Courier New" w:hAnsi="Courier New"/>
+        </w:rPr>
+        <w:t xml:space="preserve">setup_data_provider(name, file_path, object_name)</w:t>
+      </w:r>
+      <w:r>
+        <w:t xml:space="preserve"> creates it, uploads the file, </w:t>
+      </w:r>
+      <w:r>
+        <w:rPr>
+          <w:b/>
+        </w:rPr>
+        <w:t xml:space="preserve">and</w:t>
+      </w:r>
+      <w:r>
+        <w:rPr>
+          <w:b/>
+        </w:rPr>
+        <w:t xml:space="preserve"> </w:t>
+      </w:r>
+      <w:r>
+        <w:rPr>
+          <w:b/>
+        </w:rPr>
+        <w:t xml:space="preserve">points the FileName parameter</w:t>
+      </w:r>
+      <w:r>
+        <w:t xml:space="preserve"> at it (the step whose absence silently reads 0 rows).</w:t>
+      </w:r>
+    </w:p>
+    <w:p>
+      <w:pPr>
+        <w:numPr>
+          <w:ilvl w:val="0"/>
+          <w:numId w:val="2"/>
+        </w:numPr>
+      </w:pPr>
+      <w:r>
+        <w:rPr>
+          <w:b/>
+        </w:rPr>
+        <w:t xml:space="preserve">Import Scenario</w:t>
+      </w:r>
+      <w:r>
+        <w:t xml:space="preserve"> (</w:t>
+      </w:r>
+      <w:r>
+        <w:rPr>
+          <w:rFonts w:ascii="Courier New" w:hAnsi="Courier New"/>
+        </w:rPr>
+        <w:t xml:space="preserve">SM206025</w:t>
+      </w:r>
+      <w:r>
+        <w:t xml:space="preserve">) — maps source columns → target screen fields.</w:t>
+      </w:r>
+      <w:r>
+        <w:t xml:space="preserve"> </w:t>
+      </w:r>
+      <w:r>
+        <w:t xml:space="preserve">→ </w:t>
+      </w:r>
+      <w:r>
+        <w:rPr>
+          <w:rFonts w:ascii="Courier New" w:hAnsi="Courier New"/>
+        </w:rPr>
+        <w:t xml:space="preserve">build_import_scenario(name, screen_id, provider, provider_object, mapping)</w:t>
+      </w:r>
+      <w:r>
+        <w:t xml:space="preserve"> writes the</w:t>
+      </w:r>
+      <w:r>
+        <w:t xml:space="preserve"> </w:t>
+      </w:r>
+      <w:r>
+        <w:t xml:space="preserve">mapping (one row per submit, auto-appends the </w:t>
+      </w:r>
+      <w:r>
+        <w:rPr>
+          <w:rFonts w:ascii="Courier New" w:hAnsi="Courier New"/>
+        </w:rPr>
+        <w:t xml:space="preserve">&lt;Save&gt;</w:t>
+      </w:r>
+      <w:r>
+        <w:t xml:space="preserve"> action, reads it back to verify) and</w:t>
+      </w:r>
+      <w:r>
+        <w:t xml:space="preserve"> </w:t>
+      </w:r>
+      <w:r>
+        <w:t xml:space="preserve">runs a </w:t>
+      </w:r>
+      <w:r>
+        <w:rPr>
+          <w:b/>
+        </w:rPr>
+        <w:t xml:space="preserve">preflight</w:t>
+      </w:r>
+      <w:r>
+        <w:t xml:space="preserve"> that warns about the common silent-failure traps.</w:t>
+      </w:r>
+    </w:p>
+    <w:p>
+      <w:pPr>
+        <w:numPr>
+          <w:ilvl w:val="0"/>
+          <w:numId w:val="2"/>
+        </w:numPr>
+      </w:pPr>
+      <w:r>
+        <w:rPr>
+          <w:b/>
+        </w:rPr>
+        <w:t xml:space="preserve">Import by Scenario</w:t>
+      </w:r>
+      <w:r>
+        <w:t xml:space="preserve"> (</w:t>
+      </w:r>
+      <w:r>
+        <w:rPr>
+          <w:rFonts w:ascii="Courier New" w:hAnsi="Courier New"/>
+        </w:rPr>
+        <w:t xml:space="preserve">SM206036</w:t>
+      </w:r>
+      <w:r>
+        <w:t xml:space="preserve">) — Prepare (stage) → Import (commit).</w:t>
+      </w:r>
+      <w:r>
+        <w:t xml:space="preserve"> </w:t>
+      </w:r>
+      <w:r>
+        <w:t xml:space="preserve">→ </w:t>
+      </w:r>
+      <w:r>
+        <w:rPr>
+          <w:rFonts w:ascii="Courier New" w:hAnsi="Courier New"/>
+        </w:rPr>
+        <w:t xml:space="preserve">import_excel(scenario_name, file_path, do_import=true)</w:t>
+      </w:r>
+      <w:r>
+        <w:t xml:space="preserve"> runs the whole thing with polling</w:t>
+      </w:r>
+      <w:r>
+        <w:t xml:space="preserve"> </w:t>
+      </w:r>
+      <w:r>
+        <w:t xml:space="preserve">and an honest </w:t>
+      </w:r>
+      <w:r>
+        <w:rPr>
+          <w:rFonts w:ascii="Courier New" w:hAnsi="Courier New"/>
+        </w:rPr>
+        <w:t xml:space="preserve">IsProcessed</w:t>
+      </w:r>
+      <w:r>
+        <w:t xml:space="preserve"> verdict.</w:t>
+      </w:r>
+    </w:p>
+    <w:p>
+      <w:r>
+        <w:rPr>
+          <w:b/>
+        </w:rPr>
+        <w:t xml:space="preserve">Don’t hand-craft the mapping — clone the vendor recipe.</w:t>
+      </w:r>
+      <w:r>
+        <w:t xml:space="preserve"> Acumatica ships inactive</w:t>
+      </w:r>
+      <w:r>
+        <w:t xml:space="preserve"> </w:t>
+      </w:r>
+      <w:r>
+        <w:rPr>
+          <w:rFonts w:ascii="Courier New" w:hAnsi="Courier New"/>
+        </w:rPr>
+        <w:t xml:space="preserve">ACU Import …</w:t>
+      </w:r>
+      <w:r>
+        <w:t xml:space="preserve"> scenarios for the migration screens. Call </w:t>
+      </w:r>
+      <w:r>
+        <w:rPr>
+          <w:rFonts w:ascii="Courier New" w:hAnsi="Courier New"/>
+        </w:rPr>
+        <w:t xml:space="preserve">stock_scenario_info(screen_id)</w:t>
+      </w:r>
+      <w:r>
+        <w:t xml:space="preserve"> to</w:t>
+      </w:r>
+      <w:r>
+        <w:t xml:space="preserve"> </w:t>
+      </w:r>
+      <w:r>
+        <w:t xml:space="preserve">read the authoritative field order, the exact source-column names, and priming fields; build your</w:t>
+      </w:r>
+      <w:r>
+        <w:t xml:space="preserve"> </w:t>
+      </w:r>
+      <w:r>
+        <w:t xml:space="preserve">file with those column headers and mirror the mapping.</w:t>
+      </w:r>
+    </w:p>
+    <w:p>
+      <w:r>
+        <w:rPr>
+          <w:b/>
+        </w:rPr>
+        <w:t xml:space="preserve">Rules that make it work reliably (all guarded/warned by the tools):</w:t>
+      </w:r>
+    </w:p>
+    <w:p>
+      <w:pPr>
+        <w:numPr>
+          <w:ilvl w:val="0"/>
+          <w:numId w:val="1"/>
+        </w:numPr>
+      </w:pPr>
+      <w:r>
+        <w:rPr>
+          <w:b/>
+        </w:rPr>
+        <w:t xml:space="preserve">Real Excel only.</w:t>
+      </w:r>
+      <w:r>
+        <w:t xml:space="preserve"> An </w:t>
+      </w:r>
+      <w:r>
+        <w:rPr>
+          <w:rFonts w:ascii="Courier New" w:hAnsi="Courier New"/>
+        </w:rPr>
+        <w:t xml:space="preserve">.xlsx</w:t>
+      </w:r>
+      <w:r>
+        <w:t xml:space="preserve"> written by openpyxl reads as empty; author with real Excel (COM).</w:t>
+      </w:r>
+    </w:p>
+    <w:p>
+      <w:pPr>
+        <w:numPr>
+          <w:ilvl w:val="0"/>
+          <w:numId w:val="1"/>
+        </w:numPr>
+      </w:pPr>
+      <w:r>
+        <w:rPr>
+          <w:b/>
+        </w:rPr>
+        <w:t xml:space="preserve">Fresh filename per re-import.</w:t>
+      </w:r>
+      <w:r>
+        <w:t xml:space="preserve"> A same-name re-upload can read a stale cached copy.</w:t>
+      </w:r>
+    </w:p>
+    <w:p>
+      <w:pPr>
+        <w:numPr>
+          <w:ilvl w:val="0"/>
+          <w:numId w:val="1"/>
+        </w:numPr>
+      </w:pPr>
+      <w:r>
+        <w:rPr>
+          <w:b/>
+        </w:rPr>
+        <w:t xml:space="preserve">Plain column references</w:t>
+      </w:r>
+      <w:r>
+        <w:t xml:space="preserve"> in the mapping (the classic writer silently drops </w:t>
+      </w:r>
+      <w:r>
+        <w:rPr>
+          <w:rFonts w:ascii="Courier New" w:hAnsi="Courier New"/>
+        </w:rPr>
+        <w:t xml:space="preserve">=</w:t>
+      </w:r>
+      <w:r>
+        <w:t xml:space="preserve"> formulas).</w:t>
+      </w:r>
+    </w:p>
+    <w:p>
+      <w:pPr>
+        <w:numPr>
+          <w:ilvl w:val="0"/>
+          <w:numId w:val="1"/>
+        </w:numPr>
+      </w:pPr>
+      <w:r>
+        <w:rPr>
+          <w:b/>
+        </w:rPr>
+        <w:t xml:space="preserve">Numeric fields → a real column</w:t>
+      </w:r>
+      <w:r>
+        <w:t xml:space="preserve">, never a bare literal like </w:t>
+      </w:r>
+      <w:r>
+        <w:rPr>
+          <w:rFonts w:ascii="Courier New" w:hAnsi="Courier New"/>
+        </w:rPr>
+        <w:t xml:space="preserve">"1"</w:t>
+      </w:r>
+      <w:r>
+        <w:t xml:space="preserve"> (a bare value binds as a</w:t>
+      </w:r>
+      <w:r>
+        <w:t xml:space="preserve"> </w:t>
+      </w:r>
+      <w:r>
+        <w:t xml:space="preserve">phantom source column and imports empty).</w:t>
+      </w:r>
+    </w:p>
+    <w:p>
+      <w:pPr>
+        <w:numPr>
+          <w:ilvl w:val="0"/>
+          <w:numId w:val="1"/>
+        </w:numPr>
+      </w:pPr>
+      <w:r>
+        <w:rPr>
+          <w:b/>
+        </w:rPr>
+        <w:t xml:space="preserve">Priming field before the computed field</w:t>
+      </w:r>
+      <w:r>
+        <w:t xml:space="preserve"> — e.g. map </w:t>
+      </w:r>
+      <w:r>
+        <w:rPr>
+          <w:rFonts w:ascii="Courier New" w:hAnsi="Courier New"/>
+        </w:rPr>
+        <w:t xml:space="preserve">InventoryID</w:t>
+      </w:r>
+      <w:r>
+        <w:t xml:space="preserve"> before </w:t>
+      </w:r>
+      <w:r>
+        <w:rPr>
+          <w:rFonts w:ascii="Courier New" w:hAnsi="Courier New"/>
+        </w:rPr>
+        <w:t xml:space="preserve">Qty</w:t>
+      </w:r>
+      <w:r>
+        <w:t xml:space="preserve"> so the line’s</w:t>
+      </w:r>
+      <w:r>
+        <w:t xml:space="preserve"> </w:t>
+      </w:r>
+      <w:r>
+        <w:t xml:space="preserve">computed </w:t>
+      </w:r>
+      <w:r>
+        <w:rPr>
+          <w:rFonts w:ascii="Courier New" w:hAnsi="Courier New"/>
+        </w:rPr>
+        <w:t xml:space="preserve">BaseQty</w:t>
+      </w:r>
+      <w:r>
+        <w:t xml:space="preserve"> defaults; put an explicit </w:t>
+      </w:r>
+      <w:r>
+        <w:rPr>
+          <w:rFonts w:ascii="Courier New" w:hAnsi="Courier New"/>
+        </w:rPr>
+        <w:t xml:space="preserve">0</w:t>
+      </w:r>
+      <w:r>
+        <w:t xml:space="preserve"> in alternating-blank debit/credit columns.</w:t>
+      </w:r>
+    </w:p>
+    <w:p>
+      <w:pPr>
+        <w:numPr>
+          <w:ilvl w:val="0"/>
+          <w:numId w:val="1"/>
+        </w:numPr>
+      </w:pPr>
+      <w:r>
+        <w:rPr>
+          <w:b/>
+        </w:rPr>
+        <w:t xml:space="preserve">End with </w:t>
+      </w:r>
+      <w:r>
+        <w:rPr>
+          <w:rFonts w:ascii="Courier New" w:hAnsi="Courier New"/>
+        </w:rPr>
+        <w:t xml:space="preserve">&lt;Save&gt;</w:t>
+      </w:r>
+      <w:r>
+        <w:t xml:space="preserve">, and trust </w:t>
+      </w:r>
+      <w:r>
+        <w:rPr>
+          <w:rFonts w:ascii="Courier New" w:hAnsi="Courier New"/>
+        </w:rPr>
+        <w:t xml:space="preserve">IsProcessed</w:t>
+      </w:r>
+      <w:r>
+        <w:t xml:space="preserve"> (not “finished”) as the success signal.</w:t>
+      </w:r>
+    </w:p>
+    <w:p>
+      <w:r>
+        <w:rPr>
+          <w:b/>
+        </w:rPr>
+        <w:t xml:space="preserve">Prerequisites still apply.</w:t>
+      </w:r>
+      <w:r>
+        <w:t xml:space="preserve"> An import only commits if the target screen’s </w:t>
+      </w:r>
+      <w:r>
+        <w:rPr>
+          <w:b/>
+        </w:rPr>
+        <w:t xml:space="preserve">master data already</w:t>
+      </w:r>
+      <w:r>
+        <w:rPr>
+          <w:b/>
+        </w:rPr>
+        <w:t xml:space="preserve"> </w:t>
+      </w:r>
+      <w:r>
+        <w:rPr>
+          <w:b/>
+        </w:rPr>
+        <w:t xml:space="preserve">exists</w:t>
+      </w:r>
+      <w:r>
+        <w:t xml:space="preserve"> — you can’t import an AP bill without a vendor, or a cash sale without a cash account. A</w:t>
+      </w:r>
+      <w:r>
+        <w:t xml:space="preserve"> </w:t>
+      </w:r>
+      <w:r>
+        <w:t xml:space="preserve">real migration is therefore: set up master data first (companies, accounts, classes, customers,</w:t>
+      </w:r>
+      <w:r>
+        <w:t xml:space="preserve"> </w:t>
+      </w:r>
+      <w:r>
+        <w:t xml:space="preserve">vendors, items…), </w:t>
+      </w:r>
+      <w:r>
+        <w:rPr>
+          <w:b/>
+        </w:rPr>
+        <w:t xml:space="preserve">then</w:t>
+      </w:r>
+      <w:r>
+        <w:t xml:space="preserve"> run the transactional imports in dependency order.</w:t>
       </w:r>
     </w:p>
     <w:p>
@@ -4997,7 +5878,7 @@
         <w:rPr>
           <w:i/>
         </w:rPr>
-        <w:t xml:space="preserve">grp-mcp v0.51 · Published on PyPI as </w:t>
+        <w:t xml:space="preserve">grp-mcp v0.52.1 · Published on PyPI as </w:t>
       </w:r>
       <w:r>
         <w:rPr>

</xml_diff>

<commit_message>
docs: add PyPI/GitHub links + refresh version to 0.52.3 in setup guide
Co-Authored-By: Claude Opus 4.8 <noreply@anthropic.com>
</commit_message>
<xml_diff>
--- a/grp-mcp-Installation-and-Setup-Guide.docx
+++ b/grp-mcp-Installation-and-Setup-Guide.docx
@@ -15,7 +15,7 @@
         <w:rPr>
           <w:b/>
         </w:rPr>
-        <w:t xml:space="preserve">Version 0.52.1 · Acumatica ERP MCP Server</w:t>
+        <w:t xml:space="preserve">Version 0.52.3 · Acumatica ERP MCP Server</w:t>
       </w:r>
     </w:p>
     <w:p>
@@ -80,6 +80,65 @@
       </w:r>
       <w:r>
         <w:t xml:space="preserve">automatically.</w:t>
+      </w:r>
+    </w:p>
+    <w:p>
+      <w:r>
+        <w:rPr>
+          <w:b/>
+        </w:rPr>
+        <w:t xml:space="preserve">Links:</w:t>
+      </w:r>
+    </w:p>
+    <w:p>
+      <w:pPr>
+        <w:numPr>
+          <w:ilvl w:val="0"/>
+          <w:numId w:val="1"/>
+        </w:numPr>
+      </w:pPr>
+      <w:r>
+        <w:t xml:space="preserve">PyPI (package): </w:t>
+      </w:r>
+      <w:r>
+        <w:rPr>
+          <w:b/>
+        </w:rPr>
+        <w:t xml:space="preserve">https://pypi.org/project/grp-mcp/</w:t>
+      </w:r>
+    </w:p>
+    <w:p>
+      <w:pPr>
+        <w:numPr>
+          <w:ilvl w:val="0"/>
+          <w:numId w:val="1"/>
+        </w:numPr>
+      </w:pPr>
+      <w:r>
+        <w:t xml:space="preserve">Source (GitHub): </w:t>
+      </w:r>
+      <w:r>
+        <w:rPr>
+          <w:b/>
+        </w:rPr>
+        <w:t xml:space="preserve">https://github.com/Arvindh95Censof/grp-mcp</w:t>
+      </w:r>
+    </w:p>
+    <w:p>
+      <w:pPr>
+        <w:numPr>
+          <w:ilvl w:val="0"/>
+          <w:numId w:val="1"/>
+        </w:numPr>
+      </w:pPr>
+      <w:r>
+        <w:t xml:space="preserve">Releases / changelog: </w:t>
+      </w:r>
+      <w:r>
+        <w:rPr>
+          <w:b/>
+        </w:rPr>
+        <w:t xml:space="preserve">https://github.com/Arvindh95Censof/grp-mcp/releases</w:t>
       </w:r>
     </w:p>
     <w:p>
@@ -4948,7 +5007,7 @@
         <w:rPr>
           <w:rFonts w:ascii="Courier New" w:hAnsi="Courier New"/>
         </w:rPr>
-        <w:t xml:space="preserve">uvx grp-mcp==0.52.1</w:t>
+        <w:t xml:space="preserve">uvx grp-mcp==0.52.3</w:t>
       </w:r>
       <w:r>
         <w:t xml:space="preserve">). After any upgrade, </w:t>
@@ -4966,7 +5025,31 @@
         <w:t xml:space="preserve"> </w:t>
       </w:r>
       <w:r>
-        <w:t xml:space="preserve">reloads the server.</w:t>
+        <w:t xml:space="preserve">reloads the server. See the release history at</w:t>
+      </w:r>
+      <w:r>
+        <w:t xml:space="preserve"> </w:t>
+      </w:r>
+      <w:r>
+        <w:rPr>
+          <w:b/>
+        </w:rPr>
+        <w:t xml:space="preserve">https://github.com/Arvindh95Censof/grp-mcp/releases</w:t>
+      </w:r>
+      <w:r>
+        <w:t xml:space="preserve"> (and the package page,</w:t>
+      </w:r>
+      <w:r>
+        <w:t xml:space="preserve"> </w:t>
+      </w:r>
+      <w:r>
+        <w:rPr>
+          <w:b/>
+        </w:rPr>
+        <w:t xml:space="preserve">https://pypi.org/project/grp-mcp/</w:t>
+      </w:r>
+      <w:r>
+        <w:t xml:space="preserve">).</w:t>
       </w:r>
     </w:p>
     <w:p>
@@ -5878,19 +5961,7 @@
         <w:rPr>
           <w:i/>
         </w:rPr>
-        <w:t xml:space="preserve">grp-mcp v0.52.1 · Published on PyPI as </w:t>
-      </w:r>
-      <w:r>
-        <w:rPr>
-          <w:rFonts w:ascii="Courier New" w:hAnsi="Courier New"/>
-        </w:rPr>
-        <w:t xml:space="preserve">grp-mcp</w:t>
-      </w:r>
-      <w:r>
-        <w:rPr>
-          <w:i/>
-        </w:rPr>
-        <w:t xml:space="preserve"> · Source: github.com/Arvindh95Censof/grp-mcp</w:t>
+        <w:t xml:space="preserve">grp-mcp v0.52.3 · PyPI: https://pypi.org/project/grp-mcp/ · Source: https://github.com/Arvindh95Censof/grp-mcp</w:t>
       </w:r>
     </w:p>
   </w:body>

</xml_diff>